<commit_message>
Web de la consultora: 8 idiomas (es, en, pt, fr, de, it, ar, zh) y mercados sin límite de países
- Textos en src/lang/*.php con respaldo en español; detección del idioma del navegador y selector
- Árabe de derecha a izquierda, fuentes para árabe y chino
- Inicio con regiones del mundo en lugar de una lista de 4 países; formulario con mercado de interés
- Ingreso con Google para cualquier país; DNI solo para clientes de Argentina
- Presentación y documento de cultura actualizados; pruebas ampliadas

Co-Authored-By: Claude Sonnet 5.5 <noreply@anthropic.com>
</commit_message>
<xml_diff>
--- a/06_Documentos/Cultura_de_la_Consultora.docx
+++ b/06_Documentos/Cultura_de_la_Consultora.docx
@@ -936,7 +936,16 @@
         <w:pStyle w:val="Heading1"/>
       </w:pPr>
       <w:r>
-        <w:t>6. Trabajar con culturas de Medio Oriente</w:t>
+        <w:t>6. Trabajar con la cultura de cada mercado</w:t>
+      </w:r>
+    </w:p>
+    <w:p>
+      <w:r>
+        <w:rPr>
+          <w:b w:val="0"/>
+          <w:i w:val="0"/>
+        </w:rPr>
+        <w:t>Trabajamos con cualquier país del mundo. Nuestro caso actual es Medio Oriente y por eso la tabla toma ese ejemplo, pero las mismas reglas valen para Europa, Asia, África o América: estudiar la cultura del mercado antes de contactar al comprador.</w:t>
       </w:r>
     </w:p>
     <w:tbl>

</xml_diff>